<commit_message>
Rule: always create an unbranded local copy of every doc deliverable
Owner directive — for every documentation deliverable, also produce an unbranded
(white-label) version stored ONLY locally in the repo (docs/), for reuse outside
sales. Added project CLAUDE.md + memory. Applied to the HDR AD RID assessment
(added -unbranded .pdf/.docx alongside the branded copies).

Co-Authored-By: Claude Opus 4.8 <noreply@anthropic.com>
</commit_message>
<xml_diff>
--- a/build/hdr-ad-rid-assessment/v1.0.0/deliverables/HDRAD-Solution.docx
+++ b/build/hdr-ad-rid-assessment/v1.0.0/deliverables/HDRAD-Solution.docx
@@ -7,32 +7,6 @@
     <w:p/>
     <w:p/>
     <w:p/>
-    <w:p/>
-    <w:p>
-      <w:pPr>
-        <w:jc w:val="center"/>
-      </w:pPr>
-      <w:r>
-        <w:rPr>
-          <w:b/>
-          <w:color w:val="1F3A5F"/>
-          <w:sz w:val="52"/>
-        </w:rPr>
-        <w:t>PHOENIXTEKK</w:t>
-      </w:r>
-    </w:p>
-    <w:p>
-      <w:pPr>
-        <w:jc w:val="center"/>
-      </w:pPr>
-      <w:r>
-        <w:rPr>
-          <w:color w:val="2E86C1"/>
-          <w:sz w:val="24"/>
-        </w:rPr>
-        <w:t>Workplace Marketplace · Intune Solutions</w:t>
-      </w:r>
-    </w:p>
     <w:p/>
     <w:p>
       <w:pPr>
@@ -75,8 +49,6 @@
           <w:sz w:val="20"/>
         </w:rPr>
         <w:t>Version 1.0.0    ·    2026-07-03</w:t>
-        <w:br/>
-        <w:t>Phoenixtekk · workplace.phoenixtekk.com</w:t>
       </w:r>
     </w:p>
     <w:p>

</xml_diff>